<commit_message>
Corregir plantilla Cinco Elementos y campo responsable de compromisos
- Repara los bucles de asistentes, temas y compromisos que quedaron
  danados por ediciones manuales en Word (filas {%tr%} restauradas)
- Columna RESPONSABLE usa {{item.resposablen}} y normalizar_listas
  acepta ambas escrituras (responsablen/resposablen) de la IA
- Campo MODADALIDAD_REUNION en tipo de asistencia
- .gitignore bloquea temporales de Word (~$*)

Co-Authored-By: Claude Fable 5 <noreply@anthropic.com>
</commit_message>
<xml_diff>
--- a/templates/CINCO ELEMENTOS.docx
+++ b/templates/CINCO ELEMENTOS.docx
@@ -685,39 +685,45 @@
             <w:vAlign w:val="center"/>
           </w:tcPr>
           <w:p>
-            <w:pPr>
-              <w:rPr>
-                <w:lang w:val="en-US"/>
-              </w:rPr>
-            </w:pPr>
-            <w:r>
-              <w:rPr>
-                <w:lang w:val="en-US"/>
-              </w:rPr>
-              <w:t xml:space="preserve">{%tr for item in asistentes_reunion </w:t>
-            </w:r>
-            <w:r>
-              <w:rPr>
-                <w:lang w:val="en-US"/>
-              </w:rPr>
-              <w:t>-</w:t>
-            </w:r>
-            <w:r>
-              <w:rPr>
-                <w:lang w:val="en-US"/>
-              </w:rPr>
-              <w:t>%}</w:t>
-            </w:r>
-            <w:r>
-              <w:rPr>
-                <w:lang w:val="en-US"/>
-              </w:rPr>
-              <w:br/>
-            </w:r>
-            <w:r>
-              <w:rPr>
-                <w:lang w:val="en-US"/>
-              </w:rPr>
+            <w:r>
+              <w:t>{%tr for item in asistentes_reunion %}</w:t>
+            </w:r>
+          </w:p>
+        </w:tc>
+        <w:tc>
+          <w:tcPr>
+            <w:tcW w:w="4536" w:type="dxa"/>
+            <w:gridSpan w:val="4"/>
+          </w:tcPr>
+          <w:p/>
+        </w:tc>
+        <w:tc>
+          <w:tcPr>
+            <w:tcW w:w="1984" w:type="dxa"/>
+            <w:gridSpan w:val="2"/>
+          </w:tcPr>
+          <w:p/>
+        </w:tc>
+        <w:tc>
+          <w:tcPr>
+            <w:tcW w:w="1985" w:type="dxa"/>
+          </w:tcPr>
+          <w:p/>
+        </w:tc>
+      </w:tr>
+      <w:tr>
+        <w:trPr>
+          <w:trHeight w:val="238"/>
+          <w:jc w:val="center"/>
+        </w:trPr>
+        <w:tc>
+          <w:tcPr>
+            <w:tcW w:w="4503" w:type="dxa"/>
+            <w:gridSpan w:val="2"/>
+            <w:vAlign w:val="center"/>
+          </w:tcPr>
+          <w:p>
+            <w:r>
               <w:t>{{item.nombreasistentereu}}</w:t>
             </w:r>
           </w:p>
@@ -863,8 +869,8 @@
         <w:tblLook w:val="04A0" w:firstRow="1" w:lastRow="0" w:firstColumn="1" w:lastColumn="0" w:noHBand="0" w:noVBand="1"/>
       </w:tblPr>
       <w:tblGrid>
-        <w:gridCol w:w="82"/>
-        <w:gridCol w:w="1772"/>
+        <w:gridCol w:w="87"/>
+        <w:gridCol w:w="1767"/>
         <w:gridCol w:w="1212"/>
         <w:gridCol w:w="10200"/>
       </w:tblGrid>
@@ -1258,7 +1264,7 @@
           </w:tcPr>
           <w:p>
             <w:r>
-              <w:t>{%endfor%}</w:t>
+              <w:t>{%tr endfor %}</w:t>
             </w:r>
           </w:p>
         </w:tc>
@@ -1268,16 +1274,7 @@
             <w:vAlign w:val="center"/>
           </w:tcPr>
           <w:p>
-            <w:pPr>
-              <w:spacing w:after="0" w:line="240" w:lineRule="auto"/>
-              <w:jc w:val="both"/>
-              <w:rPr>
-                <w:rFonts w:cs="Calibri"/>
-                <w:b/>
-                <w:bCs/>
-                <w:color w:val="000000"/>
-              </w:rPr>
-            </w:pPr>
+            <w:r/>
           </w:p>
         </w:tc>
       </w:tr>
@@ -1457,86 +1454,101 @@
       <w:tr>
         <w:tc>
           <w:tcPr>
-            <w:tcW w:w="4786" w:type="dxa"/>
+            <w:tcW w:type="dxa" w:w="4786"/>
           </w:tcPr>
           <w:p>
             <w:r>
-              <w:t xml:space="preserve">{%for item in compromisos_de_reunion </w:t>
-            </w:r>
-            <w:r>
-              <w:t>-</w:t>
-            </w:r>
-            <w:r>
-              <w:t>%}</w:t>
-            </w:r>
-            <w:r>
-              <w:t>{{item.compromiso}}</w:t>
+              <w:t>{%tr for item in compromisos_de_reunion %}</w:t>
             </w:r>
           </w:p>
         </w:tc>
         <w:tc>
           <w:tcPr>
-            <w:tcW w:w="3402" w:type="dxa"/>
+            <w:tcW w:type="dxa" w:w="3402"/>
           </w:tcPr>
-          <w:p>
-            <w:r>
-              <w:t>{{item.fechac}}</w:t>
-            </w:r>
-          </w:p>
+          <w:p/>
         </w:tc>
         <w:tc>
           <w:tcPr>
-            <w:tcW w:w="2341" w:type="dxa"/>
+            <w:tcW w:type="dxa" w:w="2341"/>
           </w:tcPr>
-          <w:p>
-            <w:r>
-              <w:t>{{item.fechas}}</w:t>
-            </w:r>
-          </w:p>
+          <w:p/>
         </w:tc>
         <w:tc>
           <w:tcPr>
-            <w:tcW w:w="2106" w:type="dxa"/>
+            <w:tcW w:type="dxa" w:w="2106"/>
           </w:tcPr>
-          <w:p>
-            <w:r>
-              <w:t>{{item.respo</w:t>
-            </w:r>
-            <w:r>
-              <w:t>n</w:t>
-            </w:r>
-            <w:r>
-              <w:t>sable}}</w:t>
-            </w:r>
-          </w:p>
+          <w:p/>
         </w:tc>
       </w:tr>
       <w:tr>
         <w:tc>
           <w:tcPr>
-            <w:tcW w:w="4786" w:type="dxa"/>
+            <w:tcW w:type="dxa" w:w="4786"/>
           </w:tcPr>
           <w:p>
             <w:r>
-              <w:t>{%endfor %}</w:t>
+              <w:t>{{item.compromiso}}</w:t>
             </w:r>
           </w:p>
         </w:tc>
         <w:tc>
           <w:tcPr>
-            <w:tcW w:w="3402" w:type="dxa"/>
+            <w:tcW w:type="dxa" w:w="3402"/>
+          </w:tcPr>
+          <w:p>
+            <w:r>
+              <w:t>{{item.fechac}}</w:t>
+            </w:r>
+          </w:p>
+        </w:tc>
+        <w:tc>
+          <w:tcPr>
+            <w:tcW w:type="dxa" w:w="2341"/>
+          </w:tcPr>
+          <w:p>
+            <w:r>
+              <w:t>{{item.fechas}}</w:t>
+            </w:r>
+          </w:p>
+        </w:tc>
+        <w:tc>
+          <w:tcPr>
+            <w:tcW w:type="dxa" w:w="2106"/>
+          </w:tcPr>
+          <w:p>
+            <w:r>
+              <w:t>{{item.resposablen}}</w:t>
+            </w:r>
+          </w:p>
+        </w:tc>
+      </w:tr>
+      <w:tr>
+        <w:tc>
+          <w:tcPr>
+            <w:tcW w:type="dxa" w:w="4786"/>
+          </w:tcPr>
+          <w:p>
+            <w:r>
+              <w:t>{%tr endfor %}</w:t>
+            </w:r>
+          </w:p>
+        </w:tc>
+        <w:tc>
+          <w:tcPr>
+            <w:tcW w:type="dxa" w:w="3402"/>
           </w:tcPr>
           <w:p/>
         </w:tc>
         <w:tc>
           <w:tcPr>
-            <w:tcW w:w="2341" w:type="dxa"/>
+            <w:tcW w:type="dxa" w:w="2341"/>
           </w:tcPr>
           <w:p/>
         </w:tc>
         <w:tc>
           <w:tcPr>
-            <w:tcW w:w="2106" w:type="dxa"/>
+            <w:tcW w:type="dxa" w:w="2106"/>
           </w:tcPr>
           <w:p/>
         </w:tc>
@@ -2809,30 +2821,54 @@
               <w:rFonts w:ascii="Verdana" w:hAnsi="Verdana"/>
               <w:noProof/>
             </w:rPr>
-            <w:pict w14:anchorId="5002C200">
-              <v:shapetype id="_x0000_t75" coordsize="21600,21600" o:spt="75" o:preferrelative="t" path="m@4@5l@4@11@9@11@9@5xe" filled="f" stroked="f">
-                <v:stroke joinstyle="miter"/>
-                <v:formulas>
-                  <v:f eqn="if lineDrawn pixelLineWidth 0"/>
-                  <v:f eqn="sum @0 1 0"/>
-                  <v:f eqn="sum 0 0 @1"/>
-                  <v:f eqn="prod @2 1 2"/>
-                  <v:f eqn="prod @3 21600 pixelWidth"/>
-                  <v:f eqn="prod @3 21600 pixelHeight"/>
-                  <v:f eqn="sum @0 0 1"/>
-                  <v:f eqn="prod @6 1 2"/>
-                  <v:f eqn="prod @7 21600 pixelWidth"/>
-                  <v:f eqn="sum @8 21600 0"/>
-                  <v:f eqn="prod @7 21600 pixelHeight"/>
-                  <v:f eqn="sum @10 21600 0"/>
-                </v:formulas>
-                <v:path o:extrusionok="f" gradientshapeok="t" o:connecttype="rect"/>
-                <o:lock v:ext="edit" aspectratio="t"/>
-              </v:shapetype>
-              <v:shape id="Imagen 4" o:spid="_x0000_i1025" type="#_x0000_t75" style="width:67.4pt;height:52.4pt;visibility:visible">
-                <v:imagedata r:id="rId1" o:title=""/>
-              </v:shape>
-            </w:pict>
+            <w:drawing>
+              <wp:inline distT="0" distB="0" distL="0" distR="0" wp14:anchorId="5002C200" wp14:editId="0060205D">
+                <wp:extent cx="855980" cy="665480"/>
+                <wp:effectExtent l="0" t="0" r="0" b="0"/>
+                <wp:docPr id="1" name="Imagen 4"/>
+                <wp:cNvGraphicFramePr>
+                  <a:graphicFrameLocks xmlns:a="http://schemas.openxmlformats.org/drawingml/2006/main" noChangeAspect="1"/>
+                </wp:cNvGraphicFramePr>
+                <a:graphic xmlns:a="http://schemas.openxmlformats.org/drawingml/2006/main">
+                  <a:graphicData uri="http://schemas.openxmlformats.org/drawingml/2006/picture">
+                    <pic:pic xmlns:pic="http://schemas.openxmlformats.org/drawingml/2006/picture">
+                      <pic:nvPicPr>
+                        <pic:cNvPr id="0" name="Imagen 4"/>
+                        <pic:cNvPicPr>
+                          <a:picLocks noChangeAspect="1" noChangeArrowheads="1"/>
+                        </pic:cNvPicPr>
+                      </pic:nvPicPr>
+                      <pic:blipFill>
+                        <a:blip r:embed="rId1">
+                          <a:extLst>
+                            <a:ext uri="{28A0092B-C50C-407E-A947-70E740481C1C}">
+                              <a14:useLocalDpi xmlns:a14="http://schemas.microsoft.com/office/drawing/2010/main" val="0"/>
+                            </a:ext>
+                          </a:extLst>
+                        </a:blip>
+                        <a:srcRect/>
+                        <a:stretch>
+                          <a:fillRect/>
+                        </a:stretch>
+                      </pic:blipFill>
+                      <pic:spPr bwMode="auto">
+                        <a:xfrm>
+                          <a:off x="0" y="0"/>
+                          <a:ext cx="855980" cy="665480"/>
+                        </a:xfrm>
+                        <a:prstGeom prst="rect">
+                          <a:avLst/>
+                        </a:prstGeom>
+                        <a:noFill/>
+                        <a:ln>
+                          <a:noFill/>
+                        </a:ln>
+                      </pic:spPr>
+                    </pic:pic>
+                  </a:graphicData>
+                </a:graphic>
+              </wp:inline>
+            </w:drawing>
           </w:r>
         </w:p>
       </w:tc>

</xml_diff>